<commit_message>
v1.1.7 release (see CHANGELOG.md)
</commit_message>
<xml_diff>
--- a/guoan-wechat-writer/tools/research-docx/reference.docx
+++ b/guoan-wechat-writer/tools/research-docx/reference.docx
@@ -697,7 +697,7 @@
       <w:ind w:firstLineChars="200" w:firstLine="640"/>
     </w:pPr>
     <w:rPr>
-      <w:rFonts w:ascii="Times New Roman" w:hAnsi="Times New Roman" w:eastAsia="仿宋_GB2312" w:cs="Times New Roman"/>
+      <w:rFonts w:ascii="Times New Roman" w:hAnsi="Times New Roman" w:eastAsia="仿宋" w:cs="Times New Roman"/>
       <w:sz w:val="32"/>
       <w:szCs w:val="32"/>
     </w:rPr>
@@ -891,7 +891,7 @@
       <w:ind w:firstLineChars="200" w:firstLine="640"/>
     </w:pPr>
     <w:rPr>
-      <w:rFonts w:ascii="Times New Roman" w:hAnsi="Times New Roman" w:eastAsia="楷体_GB2312" w:cs="Times New Roman"/>
+      <w:rFonts w:ascii="Times New Roman" w:hAnsi="Times New Roman" w:eastAsia="楷体" w:cs="Times New Roman"/>
       <w:b w:val="0"/>
       <w:color w:val="000000"/>
       <w:sz w:val="32"/>
@@ -1072,7 +1072,7 @@
     <w:link w:val="Heading2"/>
     <w:uiPriority w:val="9"/>
     <w:rPr>
-      <w:rFonts w:ascii="Times New Roman" w:hAnsi="Times New Roman" w:eastAsia="楷体_GB2312" w:cs="Times New Roman"/>
+      <w:rFonts w:ascii="Times New Roman" w:hAnsi="Times New Roman" w:eastAsia="楷体" w:cs="Times New Roman"/>
       <w:b w:val="0"/>
       <w:color w:val="000000"/>
       <w:sz w:val="32"/>
@@ -1342,7 +1342,7 @@
     <w:name w:val="LeadSentence"/>
     <w:basedOn w:val="DefaultParagraphFont"/>
     <w:rPr>
-      <w:rFonts w:ascii="Times New Roman" w:hAnsi="Times New Roman" w:eastAsia="楷体_GB2312" w:cs="Times New Roman"/>
+      <w:rFonts w:ascii="Times New Roman" w:hAnsi="Times New Roman" w:eastAsia="楷体" w:cs="Times New Roman"/>
       <w:color w:val="000000"/>
       <w:sz w:val="32"/>
       <w:szCs w:val="32"/>

</xml_diff>